<commit_message>
feat: 관리자 생성 이력 탭 (Vercel KV)
- @vercel/kv 설치
- lib/activityLog.ts: Redis List 기반 로그 push/get/clear
- app/api/admin/activity/route.ts: GET(조회) / DELETE(삭제) 엔드포인트
- app/api/asana/create-tasks: 성공 시 KV에 비동기 로깅 (실패해도 생성 영향 없음)
- app/admin/page.tsx: "생성 이력" 탭 추가
  - 총 생성건수 / 태스크 수 / 사용자 수 요약 카드
  - 시각, 섹션명, 아티스트, 이벤트 구분, 태스크 수, 사용자(토큰 마지막 4자리) 테이블
- types/asana.ts: projectName 필드 추가
- app/page.tsx: fetch body에 projectName 전달

Co-Authored-By: Claude Sonnet 4.6 <noreply@anthropic.com>
</commit_message>
<xml_diff>
--- a/ProposalToAsanaV2/자료/파싱조건_정리.docx
+++ b/ProposalToAsanaV2/자료/파싱조건_정리.docx
@@ -40,7 +40,7 @@
           <w:sz w:val="22"/>
           <w:szCs w:val="22"/>
         </w:rPr>
-        <w:t xml:space="preserve">   |   작성일 2026.04</w:t>
+        <w:t xml:space="preserve">   |   작성일 2026.05</w:t>
       </w:r>
     </w:p>
     <w:p>
@@ -4131,6 +4131,38 @@
     </w:p>
     <w:p>
       <w:pPr>
+        <w:shd w:fill="FFF8E1" w:val="clear"/>
+        <w:spacing w:after="100" w:before="100"/>
+        <w:ind w:left="200"/>
+      </w:pPr>
+      <w:r>
+        <w:rPr>
+          <w:rFonts w:ascii="맑은 고딕" w:cs="맑은 고딕" w:eastAsia="맑은 고딕" w:hAnsi="맑은 고딕"/>
+          <w:color w:val="7B5800"/>
+          <w:sz w:val="19"/>
+          <w:szCs w:val="19"/>
+        </w:rPr>
+        <w:t xml:space="preserve">⚠  「해외 단독」 프로젝트 선택 시: 당첨자 선정 태스크를 만들지 않을까요? 팝업이 자동 표시됩니다. 확인 → 당첨자 선정 OFF 후 생성 / 취소 → ON 유지 후 생성.</w:t>
+      </w:r>
+    </w:p>
+    <w:p>
+      <w:pPr>
+        <w:shd w:fill="FFF8E1" w:val="clear"/>
+        <w:spacing w:after="100" w:before="100"/>
+        <w:ind w:left="200"/>
+      </w:pPr>
+      <w:r>
+        <w:rPr>
+          <w:rFonts w:ascii="맑은 고딕" w:cs="맑은 고딕" w:eastAsia="맑은 고딕" w:hAnsi="맑은 고딕"/>
+          <w:color w:val="7B5800"/>
+          <w:sz w:val="19"/>
+          <w:szCs w:val="19"/>
+        </w:rPr>
+        <w:t xml:space="preserve">⚠  이벤트 구분 커스텀 필드는 오픈 · 오픈 디자인 태스크에만 자동 입력됩니다. MD, VMD, 업데이트, 당첨자 선정에는 입력하지 않습니다.</w:t>
+      </w:r>
+    </w:p>
+    <w:p>
+      <w:pPr>
         <w:spacing w:after="0" w:before="200"/>
       </w:pPr>
       <w:r>
@@ -4640,7 +4672,7 @@
           <w:sz w:val="20"/>
           <w:szCs w:val="20"/>
         </w:rPr>
-        <w:t xml:space="preserve">미리보기 화면 상단 '상품코드 / 아티스트 코드' 입력 후 일괄 적용 버튼으로 변경 가능</w:t>
+        <w:t xml:space="preserve">미리보기 화면 상단 ‘상품코드’ 입력 후 ‘일괄 적용’ 버튼으로 변경 가능</w:t>
       </w:r>
     </w:p>
     <w:p>
@@ -5491,7 +5523,7 @@
           <w:sz w:val="20"/>
           <w:szCs w:val="20"/>
         </w:rPr>
-        <w:t>이 앱은 토큰을 브라우저 로컬 저장소(localStorage)에만 저장하며 서버에는 저장하지 않음</w:t>
+        <w:t xml:space="preserve">이 앱은 토큰을 브라우저 세션 저장소(sessionStorage)에 임시 저장하며, 탭을 닫으면 자동 삭제됨. 서버에는 저장하지 않음</w:t>
       </w:r>
     </w:p>
     <w:p>
@@ -5510,6 +5542,1224 @@
           <w:szCs w:val="20"/>
         </w:rPr>
         <w:t>토큰 분실 또는 유출 시 즉시 삭제 후 재발급 권장</w:t>
+      </w:r>
+    </w:p>
+    <!-- ===== 11. VMD 진행장소별 자동 구성 ===== -->
+    <w:p>
+      <w:pPr>
+        <w:pBdr>
+          <w:bottom w:val="single" w:color="1C2B4A" w:sz="6" w:space="4"/>
+        </w:pBdr>
+        <w:spacing w:after="160" w:before="400"/>
+      </w:pPr>
+      <w:r>
+        <w:rPr>
+          <w:rFonts w:ascii="맑은 고딕" w:cs="맑은 고딕" w:eastAsia="맑은 고딕" w:hAnsi="맑은 고딕"/>
+          <w:b/>
+          <w:bCs/>
+          <w:color w:val="1C2B4A"/>
+          <w:sz w:val="30"/>
+          <w:szCs w:val="30"/>
+        </w:rPr>
+        <w:t xml:space="preserve">11.  VMD 진행장소별 자동 구성</w:t>
+      </w:r>
+    </w:p>
+    <w:p>
+      <w:pPr>
+        <w:spacing w:after="60" w:before="0"/>
+      </w:pPr>
+      <w:r>
+        <w:rPr>
+          <w:rFonts w:ascii="맑은 고딕" w:cs="맑은 고딕" w:eastAsia="맑은 고딕" w:hAnsi="맑은 고딕"/>
+          <w:color w:val="333333"/>
+          <w:sz w:val="20"/>
+          <w:szCs w:val="20"/>
+        </w:rPr>
+        <w:t xml:space="preserve">이벤트 개요의 ‘진행장소’ 항목을 읽어 VMD 서브태스크 설명을 자동 구성합니다.</w:t>
+      </w:r>
+    </w:p>
+    <!-- 장소별 항목 수 표 -->
+    <w:p>
+      <w:pPr>
+        <w:spacing w:after="100" w:before="280"/>
+      </w:pPr>
+      <w:r>
+        <w:rPr>
+          <w:rFonts w:ascii="맑은 고딕" w:cs="맑은 고딕" w:eastAsia="맑은 고딕" w:hAnsi="맑은 고딕"/>
+          <w:b/>
+          <w:bCs/>
+          <w:color w:val="1C2B4A"/>
+          <w:sz w:val="24"/>
+          <w:szCs w:val="24"/>
+        </w:rPr>
+        <w:t>장소별 항목 수</w:t>
+      </w:r>
+    </w:p>
+    <w:tbl>
+      <w:tblPr>
+        <w:tblW w:type="dxa" w:w="9638"/>
+        <w:tblBorders>
+          <w:top w:val="single" w:color="auto" w:sz="4"/>
+          <w:left w:val="single" w:color="auto" w:sz="4"/>
+          <w:bottom w:val="single" w:color="auto" w:sz="4"/>
+          <w:right w:val="single" w:color="auto" w:sz="4"/>
+          <w:insideH w:val="single" w:color="auto" w:sz="4"/>
+          <w:insideV w:val="single" w:color="auto" w:sz="4"/>
+        </w:tblBorders>
+      </w:tblPr>
+      <w:tblGrid>
+        <w:gridCol w:w="3200"/>
+        <w:gridCol w:w="1400"/>
+        <w:gridCol w:w="5038"/>
+      </w:tblGrid>
+      <w:tr>
+        <w:trPr>
+          <w:tblHeader/>
+        </w:trPr>
+        <w:tc>
+          <w:tcPr>
+            <w:tcW w:type="dxa" w:w="3200"/>
+            <w:shd w:fill="E6EBF4" w:val="clear"/>
+            <w:tcMar>
+              <w:top w:type="dxa" w:w="100"/>
+              <w:left w:type="dxa" w:w="140"/>
+              <w:bottom w:type="dxa" w:w="100"/>
+              <w:right w:type="dxa" w:w="140"/>
+            </w:tcMar>
+          </w:tcPr>
+          <w:p>
+            <w:r>
+              <w:rPr>
+                <w:rFonts w:ascii="맑은 고딕" w:cs="맑은 고딕" w:eastAsia="맑은 고딕" w:hAnsi="맑은 고딕"/>
+                <w:b/>
+                <w:bCs/>
+                <w:color w:val="1C2B4A"/>
+                <w:sz w:val="19"/>
+                <w:szCs w:val="19"/>
+              </w:rPr>
+              <w:t>장소</w:t>
+            </w:r>
+          </w:p>
+        </w:tc>
+        <w:tc>
+          <w:tcPr>
+            <w:tcW w:type="dxa" w:w="1400"/>
+            <w:shd w:fill="E6EBF4" w:val="clear"/>
+            <w:tcMar>
+              <w:top w:type="dxa" w:w="100"/>
+              <w:left w:type="dxa" w:w="140"/>
+              <w:bottom w:type="dxa" w:w="100"/>
+              <w:right w:type="dxa" w:w="140"/>
+            </w:tcMar>
+          </w:tcPr>
+          <w:p>
+            <w:r>
+              <w:rPr>
+                <w:rFonts w:ascii="맑은 고딕" w:cs="맑은 고딕" w:eastAsia="맑은 고딕" w:hAnsi="맑은 고딕"/>
+                <w:b/>
+                <w:bCs/>
+                <w:color w:val="1C2B4A"/>
+                <w:sz w:val="19"/>
+                <w:szCs w:val="19"/>
+              </w:rPr>
+              <w:t>항목 수</w:t>
+            </w:r>
+          </w:p>
+        </w:tc>
+        <w:tc>
+          <w:tcPr>
+            <w:tcW w:type="dxa" w:w="5038"/>
+            <w:shd w:fill="E6EBF4" w:val="clear"/>
+            <w:tcMar>
+              <w:top w:type="dxa" w:w="100"/>
+              <w:left w:type="dxa" w:w="140"/>
+              <w:bottom w:type="dxa" w:w="100"/>
+              <w:right w:type="dxa" w:w="140"/>
+            </w:tcMar>
+          </w:tcPr>
+          <w:p>
+            <w:r>
+              <w:rPr>
+                <w:rFonts w:ascii="맑은 고딕" w:cs="맑은 고딕" w:eastAsia="맑은 고딕" w:hAnsi="맑은 고딕"/>
+                <w:b/>
+                <w:bCs/>
+                <w:color w:val="1C2B4A"/>
+                <w:sz w:val="19"/>
+                <w:szCs w:val="19"/>
+              </w:rPr>
+              <w:t>항목 목록</w:t>
+            </w:r>
+          </w:p>
+        </w:tc>
+      </w:tr>
+      <w:tr>
+        <w:tc>
+          <w:tcPr>
+            <w:tcW w:type="dxa" w:w="3200"/>
+            <w:tcMar>
+              <w:top w:type="dxa" w:w="100"/>
+              <w:left w:type="dxa" w:w="140"/>
+              <w:bottom w:type="dxa" w:w="100"/>
+              <w:right w:type="dxa" w:w="140"/>
+            </w:tcMar>
+          </w:tcPr>
+          <w:p>
+            <w:r>
+              <w:rPr>
+                <w:rFonts w:ascii="맑은 고딕" w:cs="맑은 고딕" w:eastAsia="맑은 고딕" w:hAnsi="맑은 고딕"/>
+                <w:color w:val="333333"/>
+                <w:sz w:val="19"/>
+                <w:szCs w:val="19"/>
+              </w:rPr>
+              <w:t>드림홀</w:t>
+            </w:r>
+          </w:p>
+        </w:tc>
+        <w:tc>
+          <w:tcPr>
+            <w:tcW w:type="dxa" w:w="1400"/>
+            <w:tcMar>
+              <w:top w:type="dxa" w:w="100"/>
+              <w:left w:type="dxa" w:w="140"/>
+              <w:bottom w:type="dxa" w:w="100"/>
+              <w:right w:type="dxa" w:w="140"/>
+            </w:tcMar>
+          </w:tcPr>
+          <w:p>
+            <w:r>
+              <w:rPr>
+                <w:rFonts w:ascii="맑은 고딕" w:cs="맑은 고딕" w:eastAsia="맑은 고딕" w:hAnsi="맑은 고딕"/>
+                <w:color w:val="333333"/>
+                <w:sz w:val="19"/>
+                <w:szCs w:val="19"/>
+              </w:rPr>
+              <w:t>1종</w:t>
+            </w:r>
+          </w:p>
+        </w:tc>
+        <w:tc>
+          <w:tcPr>
+            <w:tcW w:type="dxa" w:w="5038"/>
+            <w:tcMar>
+              <w:top w:type="dxa" w:w="100"/>
+              <w:left w:type="dxa" w:w="140"/>
+              <w:bottom w:type="dxa" w:w="100"/>
+              <w:right w:type="dxa" w:w="140"/>
+            </w:tcMar>
+          </w:tcPr>
+          <w:p>
+            <w:r>
+              <w:rPr>
+                <w:rFonts w:ascii="맑은 고딕" w:cs="맑은 고딕" w:eastAsia="맑은 고딕" w:hAnsi="맑은 고딕"/>
+                <w:color w:val="333333"/>
+                <w:sz w:val="19"/>
+                <w:szCs w:val="19"/>
+              </w:rPr>
+              <w:t>포토카드 1종</w:t>
+            </w:r>
+          </w:p>
+        </w:tc>
+      </w:tr>
+      <w:tr>
+        <w:tc>
+          <w:tcPr>
+            <w:tcW w:type="dxa" w:w="3200"/>
+            <w:tcMar>
+              <w:top w:type="dxa" w:w="100"/>
+              <w:left w:type="dxa" w:w="140"/>
+              <w:bottom w:type="dxa" w:w="100"/>
+              <w:right w:type="dxa" w:w="140"/>
+            </w:tcMar>
+          </w:tcPr>
+          <w:p>
+            <w:r>
+              <w:rPr>
+                <w:rFonts w:ascii="맑은 고딕" w:cs="맑은 고딕" w:eastAsia="맑은 고딕" w:hAnsi="맑은 고딕"/>
+                <w:color w:val="333333"/>
+                <w:sz w:val="19"/>
+                <w:szCs w:val="19"/>
+              </w:rPr>
+              <w:t>메이크스타 스페이스 강남</w:t>
+            </w:r>
+          </w:p>
+        </w:tc>
+        <w:tc>
+          <w:tcPr>
+            <w:tcW w:type="dxa" w:w="1400"/>
+            <w:tcMar>
+              <w:top w:type="dxa" w:w="100"/>
+              <w:left w:type="dxa" w:w="140"/>
+              <w:bottom w:type="dxa" w:w="100"/>
+              <w:right w:type="dxa" w:w="140"/>
+            </w:tcMar>
+          </w:tcPr>
+          <w:p>
+            <w:r>
+              <w:rPr>
+                <w:rFonts w:ascii="맑은 고딕" w:cs="맑은 고딕" w:eastAsia="맑은 고딕" w:hAnsi="맑은 고딕"/>
+                <w:color w:val="333333"/>
+                <w:sz w:val="19"/>
+                <w:szCs w:val="19"/>
+              </w:rPr>
+              <w:t>6종</w:t>
+            </w:r>
+          </w:p>
+        </w:tc>
+        <w:tc>
+          <w:tcPr>
+            <w:tcW w:type="dxa" w:w="5038"/>
+            <w:tcMar>
+              <w:top w:type="dxa" w:w="100"/>
+              <w:left w:type="dxa" w:w="140"/>
+              <w:bottom w:type="dxa" w:w="100"/>
+              <w:right w:type="dxa" w:w="140"/>
+            </w:tcMar>
+          </w:tcPr>
+          <w:p>
+            <w:r>
+              <w:rPr>
+                <w:rFonts w:ascii="맑은 고딕" w:cs="맑은 고딕" w:eastAsia="맑은 고딕" w:hAnsi="맑은 고딕"/>
+                <w:color w:val="333333"/>
+                <w:sz w:val="19"/>
+                <w:szCs w:val="19"/>
+              </w:rPr>
+              <w:t xml:space="preserve">포토카드 (A~F ver.) 6종</w:t>
+            </w:r>
+          </w:p>
+        </w:tc>
+      </w:tr>
+      <w:tr>
+        <w:tc>
+          <w:tcPr>
+            <w:tcW w:type="dxa" w:w="3200"/>
+            <w:tcMar>
+              <w:top w:type="dxa" w:w="100"/>
+              <w:left w:type="dxa" w:w="140"/>
+              <w:bottom w:type="dxa" w:w="100"/>
+              <w:right w:type="dxa" w:w="140"/>
+            </w:tcMar>
+          </w:tcPr>
+          <w:p>
+            <w:r>
+              <w:rPr>
+                <w:rFonts w:ascii="맑은 고딕" w:cs="맑은 고딕" w:eastAsia="맑은 고딕" w:hAnsi="맑은 고딕"/>
+                <w:color w:val="333333"/>
+                <w:sz w:val="19"/>
+                <w:szCs w:val="19"/>
+              </w:rPr>
+              <w:t>메이크스타 스페이스 상하이</w:t>
+            </w:r>
+          </w:p>
+        </w:tc>
+        <w:tc>
+          <w:tcPr>
+            <w:tcW w:type="dxa" w:w="1400"/>
+            <w:tcMar>
+              <w:top w:type="dxa" w:w="100"/>
+              <w:left w:type="dxa" w:w="140"/>
+              <w:bottom w:type="dxa" w:w="100"/>
+              <w:right w:type="dxa" w:w="140"/>
+            </w:tcMar>
+          </w:tcPr>
+          <w:p>
+            <w:r>
+              <w:rPr>
+                <w:rFonts w:ascii="맑은 고딕" w:cs="맑은 고딕" w:eastAsia="맑은 고딕" w:hAnsi="맑은 고딕"/>
+                <w:color w:val="333333"/>
+                <w:sz w:val="19"/>
+                <w:szCs w:val="19"/>
+              </w:rPr>
+              <w:t>5종</w:t>
+            </w:r>
+          </w:p>
+        </w:tc>
+        <w:tc>
+          <w:tcPr>
+            <w:tcW w:type="dxa" w:w="5038"/>
+            <w:tcMar>
+              <w:top w:type="dxa" w:w="100"/>
+              <w:left w:type="dxa" w:w="140"/>
+              <w:bottom w:type="dxa" w:w="100"/>
+              <w:right w:type="dxa" w:w="140"/>
+            </w:tcMar>
+          </w:tcPr>
+          <w:p>
+            <w:r>
+              <w:rPr>
+                <w:rFonts w:ascii="맑은 고딕" w:cs="맑은 고딕" w:eastAsia="맑은 고딕" w:hAnsi="맑은 고딕"/>
+                <w:color w:val="333333"/>
+                <w:sz w:val="19"/>
+                <w:szCs w:val="19"/>
+              </w:rPr>
+              <w:t xml:space="preserve">포카 (랜덤 1종), 사인 포카 (랜덤 1종), 스탠딩 배너 (랜덤 1종), 포스터 (랜덤 1종), 모바일 쿠폰 (1종)</w:t>
+            </w:r>
+          </w:p>
+        </w:tc>
+      </w:tr>
+      <w:tr>
+        <w:tc>
+          <w:tcPr>
+            <w:tcW w:type="dxa" w:w="3200"/>
+            <w:tcMar>
+              <w:top w:type="dxa" w:w="100"/>
+              <w:left w:type="dxa" w:w="140"/>
+              <w:bottom w:type="dxa" w:w="100"/>
+              <w:right w:type="dxa" w:w="140"/>
+            </w:tcMar>
+          </w:tcPr>
+          <w:p>
+            <w:r>
+              <w:rPr>
+                <w:rFonts w:ascii="맑은 고딕" w:cs="맑은 고딕" w:eastAsia="맑은 고딕" w:hAnsi="맑은 고딕"/>
+                <w:color w:val="333333"/>
+                <w:sz w:val="19"/>
+                <w:szCs w:val="19"/>
+              </w:rPr>
+              <w:t>메이크스타 스페이스 광저우</w:t>
+            </w:r>
+          </w:p>
+        </w:tc>
+        <w:tc>
+          <w:tcPr>
+            <w:tcW w:type="dxa" w:w="1400"/>
+            <w:tcMar>
+              <w:top w:type="dxa" w:w="100"/>
+              <w:left w:type="dxa" w:w="140"/>
+              <w:bottom w:type="dxa" w:w="100"/>
+              <w:right w:type="dxa" w:w="140"/>
+            </w:tcMar>
+          </w:tcPr>
+          <w:p>
+            <w:r>
+              <w:rPr>
+                <w:rFonts w:ascii="맑은 고딕" w:cs="맑은 고딕" w:eastAsia="맑은 고딕" w:hAnsi="맑은 고딕"/>
+                <w:color w:val="333333"/>
+                <w:sz w:val="19"/>
+                <w:szCs w:val="19"/>
+              </w:rPr>
+              <w:t>2종</w:t>
+            </w:r>
+          </w:p>
+        </w:tc>
+        <w:tc>
+          <w:tcPr>
+            <w:tcW w:type="dxa" w:w="5038"/>
+            <w:tcMar>
+              <w:top w:type="dxa" w:w="100"/>
+              <w:left w:type="dxa" w:w="140"/>
+              <w:bottom w:type="dxa" w:w="100"/>
+              <w:right w:type="dxa" w:w="140"/>
+            </w:tcMar>
+          </w:tcPr>
+          <w:p>
+            <w:r>
+              <w:rPr>
+                <w:rFonts w:ascii="맑은 고딕" w:cs="맑은 고딕" w:eastAsia="맑은 고딕" w:hAnsi="맑은 고딕"/>
+                <w:color w:val="333333"/>
+                <w:sz w:val="19"/>
+                <w:szCs w:val="19"/>
+              </w:rPr>
+              <w:t xml:space="preserve">포카 (랜덤 1종), 사인 포카 (랜덤 1종)</w:t>
+            </w:r>
+          </w:p>
+        </w:tc>
+      </w:tr>
+      <w:tr>
+        <w:tc>
+          <w:tcPr>
+            <w:tcW w:type="dxa" w:w="3200"/>
+            <w:tcMar>
+              <w:top w:type="dxa" w:w="100"/>
+              <w:left w:type="dxa" w:w="140"/>
+              <w:bottom w:type="dxa" w:w="100"/>
+              <w:right w:type="dxa" w:w="140"/>
+            </w:tcMar>
+          </w:tcPr>
+          <w:p>
+            <w:r>
+              <w:rPr>
+                <w:rFonts w:ascii="맑은 고딕" w:cs="맑은 고딕" w:eastAsia="맑은 고딕" w:hAnsi="맑은 고딕"/>
+                <w:color w:val="333333"/>
+                <w:sz w:val="19"/>
+                <w:szCs w:val="19"/>
+              </w:rPr>
+              <w:t>메이크스타 스페이스 심천</w:t>
+            </w:r>
+          </w:p>
+        </w:tc>
+        <w:tc>
+          <w:tcPr>
+            <w:tcW w:type="dxa" w:w="1400"/>
+            <w:tcMar>
+              <w:top w:type="dxa" w:w="100"/>
+              <w:left w:type="dxa" w:w="140"/>
+              <w:bottom w:type="dxa" w:w="100"/>
+              <w:right w:type="dxa" w:w="140"/>
+            </w:tcMar>
+          </w:tcPr>
+          <w:p>
+            <w:r>
+              <w:rPr>
+                <w:rFonts w:ascii="맑은 고딕" w:cs="맑은 고딕" w:eastAsia="맑은 고딕" w:hAnsi="맑은 고딕"/>
+                <w:color w:val="333333"/>
+                <w:sz w:val="19"/>
+                <w:szCs w:val="19"/>
+              </w:rPr>
+              <w:t>3종</w:t>
+            </w:r>
+          </w:p>
+        </w:tc>
+        <w:tc>
+          <w:tcPr>
+            <w:tcW w:type="dxa" w:w="5038"/>
+            <w:tcMar>
+              <w:top w:type="dxa" w:w="100"/>
+              <w:left w:type="dxa" w:w="140"/>
+              <w:bottom w:type="dxa" w:w="100"/>
+              <w:right w:type="dxa" w:w="140"/>
+            </w:tcMar>
+          </w:tcPr>
+          <w:p>
+            <w:r>
+              <w:rPr>
+                <w:rFonts w:ascii="맑은 고딕" w:cs="맑은 고딕" w:eastAsia="맑은 고딕" w:hAnsi="맑은 고딕"/>
+                <w:color w:val="333333"/>
+                <w:sz w:val="19"/>
+                <w:szCs w:val="19"/>
+              </w:rPr>
+              <w:t xml:space="preserve">포카 (랜덤 1종), 사인 포카 (랜덤 1종), 스탠딩 배너 (랜덤 1종)</w:t>
+            </w:r>
+          </w:p>
+        </w:tc>
+      </w:tr>
+    </w:tbl>
+    <!-- 복수 장소 안내 -->
+    <w:p>
+      <w:pPr>
+        <w:spacing w:after="100" w:before="280"/>
+      </w:pPr>
+      <w:r>
+        <w:rPr>
+          <w:rFonts w:ascii="맑은 고딕" w:cs="맑은 고딕" w:eastAsia="맑은 고딕" w:hAnsi="맑은 고딕"/>
+          <w:b/>
+          <w:bCs/>
+          <w:color w:val="1C2B4A"/>
+          <w:sz w:val="24"/>
+          <w:szCs w:val="24"/>
+        </w:rPr>
+        <w:t>복수 장소 지원</w:t>
+      </w:r>
+    </w:p>
+    <w:p>
+      <w:pPr>
+        <w:spacing w:after="60" w:before="0"/>
+      </w:pPr>
+      <w:r>
+        <w:rPr>
+          <w:rFonts w:ascii="맑은 고딕" w:cs="맑은 고딕" w:eastAsia="맑은 고딕" w:hAnsi="맑은 고딕"/>
+          <w:color w:val="333333"/>
+          <w:sz w:val="20"/>
+          <w:szCs w:val="20"/>
+        </w:rPr>
+        <w:t xml:space="preserve">진행장소 항목에 여러 장소가 나열된 경우, 하나의 VMD 태스크 설명 안에 장소별 섹션 헤더(▶ 상하이 매장 등)를 붙여 모든 항목을 통합 표기합니다.</w:t>
+      </w:r>
+    </w:p>
+    <w:p>
+      <w:pPr>
+        <w:numPr>
+          <w:ilvl w:val="0"/>
+          <w:numId w:val="2"/>
+        </w:numPr>
+        <w:spacing w:after="40" w:before="40"/>
+      </w:pPr>
+      <w:r>
+        <w:rPr>
+          <w:rFonts w:ascii="맑은 고딕" w:cs="맑은 고딕" w:eastAsia="맑은 고딕" w:hAnsi="맑은 고딕"/>
+          <w:color w:val="333333"/>
+          <w:sz w:val="20"/>
+          <w:szCs w:val="20"/>
+        </w:rPr>
+        <w:t xml:space="preserve">VMD 서브태스크 제목: [상품코드] VMD / N종  (N = 전체 장소 항목 수 합산)</w:t>
+      </w:r>
+    </w:p>
+    <w:p>
+      <w:pPr>
+        <w:numPr>
+          <w:ilvl w:val="0"/>
+          <w:numId w:val="2"/>
+        </w:numPr>
+        <w:spacing w:after="40" w:before="40"/>
+      </w:pPr>
+      <w:r>
+        <w:rPr>
+          <w:rFonts w:ascii="맑은 고딕" w:cs="맑은 고딕" w:eastAsia="맑은 고딕" w:hAnsi="맑은 고딕"/>
+          <w:color w:val="333333"/>
+          <w:sz w:val="20"/>
+          <w:szCs w:val="20"/>
+        </w:rPr>
+        <w:t xml:space="preserve">단일 장소: 섹션 헤더 없이 항목만 표기</w:t>
+      </w:r>
+    </w:p>
+    <w:p>
+      <w:pPr>
+        <w:numPr>
+          <w:ilvl w:val="0"/>
+          <w:numId w:val="2"/>
+        </w:numPr>
+        <w:spacing w:after="40" w:before="40"/>
+      </w:pPr>
+      <w:r>
+        <w:rPr>
+          <w:rFonts w:ascii="맑은 고딕" w:cs="맑은 고딕" w:eastAsia="맑은 고딕" w:hAnsi="맑은 고딕"/>
+          <w:color w:val="333333"/>
+          <w:sz w:val="20"/>
+          <w:szCs w:val="20"/>
+        </w:rPr>
+        <w:t xml:space="preserve">복수 장소: ▶ 장소명 헤더 후 해당 장소 항목 나열</w:t>
+      </w:r>
+    </w:p>
+    <!-- ===== 12. 파생 모드 ===== -->
+    <w:p>
+      <w:pPr>
+        <w:pBdr>
+          <w:bottom w:val="single" w:color="1C2B4A" w:sz="6" w:space="4"/>
+        </w:pBdr>
+        <w:spacing w:after="160" w:before="400"/>
+      </w:pPr>
+      <w:r>
+        <w:rPr>
+          <w:rFonts w:ascii="맑은 고딕" w:cs="맑은 고딕" w:eastAsia="맑은 고딕" w:hAnsi="맑은 고딕"/>
+          <w:b/>
+          <w:bCs/>
+          <w:color w:val="1C2B4A"/>
+          <w:sz w:val="30"/>
+          <w:szCs w:val="30"/>
+        </w:rPr>
+        <w:t xml:space="preserve">12.  파생 모드 (_CN / _NAEU)</w:t>
+      </w:r>
+    </w:p>
+    <w:p>
+      <w:pPr>
+        <w:spacing w:after="60" w:before="0"/>
+      </w:pPr>
+      <w:r>
+        <w:rPr>
+          <w:rFonts w:ascii="맑은 고딕" w:cs="맑은 고딕" w:eastAsia="맑은 고딕" w:hAnsi="맑은 고딕"/>
+          <w:color w:val="333333"/>
+          <w:sz w:val="20"/>
+          <w:szCs w:val="20"/>
+        </w:rPr>
+        <w:t xml:space="preserve">동일 이벤트를 특정 국가 대상으로 추가 진행할 때 사용합니다. 파생 모드가 감지되면 별도 섹션을 만들지 않고 기존 섹션에 태스크를 추가합니다.</w:t>
+      </w:r>
+    </w:p>
+    <!-- 자동 감지 조건 -->
+    <w:p>
+      <w:pPr>
+        <w:spacing w:after="100" w:before="280"/>
+      </w:pPr>
+      <w:r>
+        <w:rPr>
+          <w:rFonts w:ascii="맑은 고딕" w:cs="맑은 고딕" w:eastAsia="맑은 고딕" w:hAnsi="맑은 고딕"/>
+          <w:b/>
+          <w:bCs/>
+          <w:color w:val="1C2B4A"/>
+          <w:sz w:val="24"/>
+          <w:szCs w:val="24"/>
+        </w:rPr>
+        <w:t>자동 감지 조건 (두 조건 모두 충족 시)</w:t>
+      </w:r>
+    </w:p>
+    <w:p>
+      <w:pPr>
+        <w:numPr>
+          <w:ilvl w:val="0"/>
+          <w:numId w:val="2"/>
+        </w:numPr>
+        <w:spacing w:after="40" w:before="40"/>
+      </w:pPr>
+      <w:r>
+        <w:rPr>
+          <w:rFonts w:ascii="맑은 고딕" w:cs="맑은 고딕" w:eastAsia="맑은 고딕" w:hAnsi="맑은 고딕"/>
+          <w:color w:val="333333"/>
+          <w:sz w:val="20"/>
+          <w:szCs w:val="20"/>
+        </w:rPr>
+        <w:t xml:space="preserve">Asana 프로젝트에 동일한 상품코드를 포함한 섹션이 이미 존재</w:t>
+      </w:r>
+    </w:p>
+    <w:p>
+      <w:pPr>
+        <w:numPr>
+          <w:ilvl w:val="0"/>
+          <w:numId w:val="2"/>
+        </w:numPr>
+        <w:spacing w:after="40" w:before="40"/>
+      </w:pPr>
+      <w:r>
+        <w:rPr>
+          <w:rFonts w:ascii="맑은 고딕" w:cs="맑은 고딕" w:eastAsia="맑은 고딕" w:hAnsi="맑은 고딕"/>
+          <w:color w:val="333333"/>
+          <w:sz w:val="20"/>
+          <w:szCs w:val="20"/>
+        </w:rPr>
+        <w:t xml:space="preserve">현재 Asana 토큰 사용자 이름이 ‘중국사업팀’ 또는 ‘북미유럽사업팀’ 포함</w:t>
+      </w:r>
+    </w:p>
+    <!-- 자동 적용 내용 표 -->
+    <w:p>
+      <w:pPr>
+        <w:spacing w:after="100" w:before="280"/>
+      </w:pPr>
+      <w:r>
+        <w:rPr>
+          <w:rFonts w:ascii="맑은 고딕" w:cs="맑은 고딕" w:eastAsia="맑은 고딕" w:hAnsi="맑은 고딕"/>
+          <w:b/>
+          <w:bCs/>
+          <w:color w:val="1C2B4A"/>
+          <w:sz w:val="24"/>
+          <w:szCs w:val="24"/>
+        </w:rPr>
+        <w:t>자동 적용 내용</w:t>
+      </w:r>
+    </w:p>
+    <w:tbl>
+      <w:tblPr>
+        <w:tblW w:type="dxa" w:w="9638"/>
+        <w:tblBorders>
+          <w:top w:val="single" w:color="auto" w:sz="4"/>
+          <w:left w:val="single" w:color="auto" w:sz="4"/>
+          <w:bottom w:val="single" w:color="auto" w:sz="4"/>
+          <w:right w:val="single" w:color="auto" w:sz="4"/>
+          <w:insideH w:val="single" w:color="auto" w:sz="4"/>
+          <w:insideV w:val="single" w:color="auto" w:sz="4"/>
+        </w:tblBorders>
+      </w:tblPr>
+      <w:tblGrid>
+        <w:gridCol w:w="3200"/>
+        <w:gridCol w:w="6438"/>
+      </w:tblGrid>
+      <w:tr>
+        <w:trPr>
+          <w:tblHeader/>
+        </w:trPr>
+        <w:tc>
+          <w:tcPr>
+            <w:tcW w:type="dxa" w:w="3200"/>
+            <w:shd w:fill="E6EBF4" w:val="clear"/>
+            <w:tcMar>
+              <w:top w:type="dxa" w:w="100"/>
+              <w:left w:type="dxa" w:w="140"/>
+              <w:bottom w:type="dxa" w:w="100"/>
+              <w:right w:type="dxa" w:w="140"/>
+            </w:tcMar>
+          </w:tcPr>
+          <w:p>
+            <w:r>
+              <w:rPr>
+                <w:rFonts w:ascii="맑은 고딕" w:cs="맑은 고딕" w:eastAsia="맑은 고딕" w:hAnsi="맑은 고딕"/>
+                <w:b/>
+                <w:bCs/>
+                <w:color w:val="1C2B4A"/>
+                <w:sz w:val="19"/>
+                <w:szCs w:val="19"/>
+              </w:rPr>
+              <w:t>항목</w:t>
+            </w:r>
+          </w:p>
+        </w:tc>
+        <w:tc>
+          <w:tcPr>
+            <w:tcW w:type="dxa" w:w="6438"/>
+            <w:shd w:fill="E6EBF4" w:val="clear"/>
+            <w:tcMar>
+              <w:top w:type="dxa" w:w="100"/>
+              <w:left w:type="dxa" w:w="140"/>
+              <w:bottom w:type="dxa" w:w="100"/>
+              <w:right w:type="dxa" w:w="140"/>
+            </w:tcMar>
+          </w:tcPr>
+          <w:p>
+            <w:r>
+              <w:rPr>
+                <w:rFonts w:ascii="맑은 고딕" w:cs="맑은 고딕" w:eastAsia="맑은 고딕" w:hAnsi="맑은 고딕"/>
+                <w:b/>
+                <w:bCs/>
+                <w:color w:val="1C2B4A"/>
+                <w:sz w:val="19"/>
+                <w:szCs w:val="19"/>
+              </w:rPr>
+              <w:t>내용</w:t>
+            </w:r>
+          </w:p>
+        </w:tc>
+      </w:tr>
+      <w:tr>
+        <w:tc>
+          <w:tcPr>
+            <w:tcW w:type="dxa" w:w="3200"/>
+            <w:tcMar>
+              <w:top w:type="dxa" w:w="100"/>
+              <w:left w:type="dxa" w:w="140"/>
+              <w:bottom w:type="dxa" w:w="100"/>
+              <w:right w:type="dxa" w:w="140"/>
+            </w:tcMar>
+          </w:tcPr>
+          <w:p>
+            <w:r>
+              <w:rPr>
+                <w:rFonts w:ascii="맑은 고딕" w:cs="맑은 고딕" w:eastAsia="맑은 고딕" w:hAnsi="맑은 고딕"/>
+                <w:color w:val="333333"/>
+                <w:sz w:val="19"/>
+                <w:szCs w:val="19"/>
+              </w:rPr>
+              <w:t>섹션</w:t>
+            </w:r>
+          </w:p>
+        </w:tc>
+        <w:tc>
+          <w:tcPr>
+            <w:tcW w:type="dxa" w:w="6438"/>
+            <w:tcMar>
+              <w:top w:type="dxa" w:w="100"/>
+              <w:left w:type="dxa" w:w="140"/>
+              <w:bottom w:type="dxa" w:w="100"/>
+              <w:right w:type="dxa" w:w="140"/>
+            </w:tcMar>
+          </w:tcPr>
+          <w:p>
+            <w:r>
+              <w:rPr>
+                <w:rFonts w:ascii="맑은 고딕" w:cs="맑은 고딕" w:eastAsia="맑은 고딕" w:hAnsi="맑은 고딕"/>
+                <w:color w:val="333333"/>
+                <w:sz w:val="19"/>
+                <w:szCs w:val="19"/>
+              </w:rPr>
+              <w:t xml:space="preserve">신규 섹션 생성 없이 기존 섹션에 태스크 추가</w:t>
+            </w:r>
+          </w:p>
+        </w:tc>
+      </w:tr>
+      <w:tr>
+        <w:tc>
+          <w:tcPr>
+            <w:tcW w:type="dxa" w:w="3200"/>
+            <w:tcMar>
+              <w:top w:type="dxa" w:w="100"/>
+              <w:left w:type="dxa" w:w="140"/>
+              <w:bottom w:type="dxa" w:w="100"/>
+              <w:right w:type="dxa" w:w="140"/>
+            </w:tcMar>
+          </w:tcPr>
+          <w:p>
+            <w:r>
+              <w:rPr>
+                <w:rFonts w:ascii="맑은 고딕" w:cs="맑은 고딕" w:eastAsia="맑은 고딕" w:hAnsi="맑은 고딕"/>
+                <w:color w:val="333333"/>
+                <w:sz w:val="19"/>
+                <w:szCs w:val="19"/>
+              </w:rPr>
+              <w:t>상품코드 접미사</w:t>
+            </w:r>
+          </w:p>
+        </w:tc>
+        <w:tc>
+          <w:tcPr>
+            <w:tcW w:type="dxa" w:w="6438"/>
+            <w:tcMar>
+              <w:top w:type="dxa" w:w="100"/>
+              <w:left w:type="dxa" w:w="140"/>
+              <w:bottom w:type="dxa" w:w="100"/>
+              <w:right w:type="dxa" w:w="140"/>
+            </w:tcMar>
+          </w:tcPr>
+          <w:p>
+            <w:r>
+              <w:rPr>
+                <w:rFonts w:ascii="맑은 고딕" w:cs="맑은 고딕" w:eastAsia="맑은 고딕" w:hAnsi="맑은 고딕"/>
+                <w:color w:val="333333"/>
+                <w:sz w:val="19"/>
+                <w:szCs w:val="19"/>
+              </w:rPr>
+              <w:t xml:space="preserve">중국사업팀 → _CN / 북미유럽사업팀 → _NAEU 자동 추가</w:t>
+            </w:r>
+          </w:p>
+        </w:tc>
+      </w:tr>
+      <w:tr>
+        <w:tc>
+          <w:tcPr>
+            <w:tcW w:type="dxa" w:w="3200"/>
+            <w:tcMar>
+              <w:top w:type="dxa" w:w="100"/>
+              <w:left w:type="dxa" w:w="140"/>
+              <w:bottom w:type="dxa" w:w="100"/>
+              <w:right w:type="dxa" w:w="140"/>
+            </w:tcMar>
+          </w:tcPr>
+          <w:p>
+            <w:r>
+              <w:rPr>
+                <w:rFonts w:ascii="맑은 고딕" w:cs="맑은 고딕" w:eastAsia="맑은 고딕" w:hAnsi="맑은 고딕"/>
+                <w:color w:val="333333"/>
+                <w:sz w:val="19"/>
+                <w:szCs w:val="19"/>
+              </w:rPr>
+              <w:t>이벤트 구분</w:t>
+            </w:r>
+          </w:p>
+        </w:tc>
+        <w:tc>
+          <w:tcPr>
+            <w:tcW w:type="dxa" w:w="6438"/>
+            <w:tcMar>
+              <w:top w:type="dxa" w:w="100"/>
+              <w:left w:type="dxa" w:w="140"/>
+              <w:bottom w:type="dxa" w:w="100"/>
+              <w:right w:type="dxa" w:w="140"/>
+            </w:tcMar>
+          </w:tcPr>
+          <w:p>
+            <w:r>
+              <w:rPr>
+                <w:rFonts w:ascii="맑은 고딕" w:cs="맑은 고딕" w:eastAsia="맑은 고딕" w:hAnsi="맑은 고딕"/>
+                <w:color w:val="333333"/>
+                <w:sz w:val="19"/>
+                <w:szCs w:val="19"/>
+              </w:rPr>
+              <w:t xml:space="preserve">‘파생’ 고정 (변경 불가)</w:t>
+            </w:r>
+          </w:p>
+        </w:tc>
+      </w:tr>
+      <w:tr>
+        <w:tc>
+          <w:tcPr>
+            <w:tcW w:type="dxa" w:w="3200"/>
+            <w:tcMar>
+              <w:top w:type="dxa" w:w="100"/>
+              <w:left w:type="dxa" w:w="140"/>
+              <w:bottom w:type="dxa" w:w="100"/>
+              <w:right w:type="dxa" w:w="140"/>
+            </w:tcMar>
+          </w:tcPr>
+          <w:p>
+            <w:r>
+              <w:rPr>
+                <w:rFonts w:ascii="맑은 고딕" w:cs="맑은 고딕" w:eastAsia="맑은 고딕" w:hAnsi="맑은 고딕"/>
+                <w:color w:val="333333"/>
+                <w:sz w:val="19"/>
+                <w:szCs w:val="19"/>
+              </w:rPr>
+              <w:t>생성되는 태스크</w:t>
+            </w:r>
+          </w:p>
+        </w:tc>
+        <w:tc>
+          <w:tcPr>
+            <w:tcW w:type="dxa" w:w="6438"/>
+            <w:tcMar>
+              <w:top w:type="dxa" w:w="100"/>
+              <w:left w:type="dxa" w:w="140"/>
+              <w:bottom w:type="dxa" w:w="100"/>
+              <w:right w:type="dxa" w:w="140"/>
+            </w:tcMar>
+          </w:tcPr>
+          <w:p>
+            <w:r>
+              <w:rPr>
+                <w:rFonts w:ascii="맑은 고딕" w:cs="맑은 고딕" w:eastAsia="맑은 고딕" w:hAnsi="맑은 고딕"/>
+                <w:color w:val="333333"/>
+                <w:sz w:val="19"/>
+                <w:szCs w:val="19"/>
+              </w:rPr>
+              <w:t xml:space="preserve">SNS 오픈 + SNS 오픈 디자인만 생성 (당첨자 선정 · 업데이트 제외)</w:t>
+            </w:r>
+          </w:p>
+        </w:tc>
+      </w:tr>
+    </w:tbl>
+    <w:p>
+      <w:pPr>
+        <w:shd w:fill="FFF9E0" w:val="clear"/>
+        <w:spacing w:after="80" w:before="140"/>
+        <w:ind w:left="280"/>
+      </w:pPr>
+      <w:r>
+        <w:rPr>
+          <w:rFonts w:ascii="맑은 고딕" w:cs="맑은 고딕" w:eastAsia="맑은 고딕" w:hAnsi="맑은 고딕"/>
+          <w:color w:val="7A5C00"/>
+          <w:sz w:val="20"/>
+          <w:szCs w:val="20"/>
+        </w:rPr>
+        <w:t xml:space="preserve">⚠ 파생 모드는 프로젝트 선택 및 상품코드 입력 후 자동 감지됩니다. 감지 시 오렌지 배너가 표시되며, 생성 전 확인이 가능합니다.</w:t>
+      </w:r>
+    </w:p>
+    <!-- ===== 13. 보안 ===== -->
+    <w:p>
+      <w:pPr>
+        <w:pBdr>
+          <w:bottom w:val="single" w:color="1C2B4A" w:sz="6" w:space="4"/>
+        </w:pBdr>
+        <w:spacing w:after="160" w:before="400"/>
+      </w:pPr>
+      <w:r>
+        <w:rPr>
+          <w:rFonts w:ascii="맑은 고딕" w:cs="맑은 고딕" w:eastAsia="맑은 고딕" w:hAnsi="맑은 고딕"/>
+          <w:b/>
+          <w:bCs/>
+          <w:color w:val="1C2B4A"/>
+          <w:sz w:val="30"/>
+          <w:szCs w:val="30"/>
+        </w:rPr>
+        <w:t xml:space="preserve">13.  보안</w:t>
+      </w:r>
+    </w:p>
+    <!-- 토큰 저장 -->
+    <w:p>
+      <w:pPr>
+        <w:spacing w:after="100" w:before="280"/>
+      </w:pPr>
+      <w:r>
+        <w:rPr>
+          <w:rFonts w:ascii="맑은 고딕" w:cs="맑은 고딕" w:eastAsia="맑은 고딕" w:hAnsi="맑은 고딕"/>
+          <w:b/>
+          <w:bCs/>
+          <w:color w:val="1C2B4A"/>
+          <w:sz w:val="24"/>
+          <w:szCs w:val="24"/>
+        </w:rPr>
+        <w:t>Asana 토큰 저장 방식</w:t>
+      </w:r>
+    </w:p>
+    <w:p>
+      <w:pPr>
+        <w:numPr>
+          <w:ilvl w:val="0"/>
+          <w:numId w:val="2"/>
+        </w:numPr>
+        <w:spacing w:after="40" w:before="40"/>
+      </w:pPr>
+      <w:r>
+        <w:rPr>
+          <w:rFonts w:ascii="맑은 고딕" w:cs="맑은 고딕" w:eastAsia="맑은 고딕" w:hAnsi="맑은 고딕"/>
+          <w:color w:val="333333"/>
+          <w:sz w:val="20"/>
+          <w:szCs w:val="20"/>
+        </w:rPr>
+        <w:t xml:space="preserve">브라우저 sessionStorage에만 저장 — 탭을 닫으면 자동 삭제</w:t>
+      </w:r>
+    </w:p>
+    <w:p>
+      <w:pPr>
+        <w:numPr>
+          <w:ilvl w:val="0"/>
+          <w:numId w:val="2"/>
+        </w:numPr>
+        <w:spacing w:after="40" w:before="40"/>
+      </w:pPr>
+      <w:r>
+        <w:rPr>
+          <w:rFonts w:ascii="맑은 고딕" w:cs="맑은 고딕" w:eastAsia="맑은 고딕" w:hAnsi="맑은 고딕"/>
+          <w:color w:val="333333"/>
+          <w:sz w:val="20"/>
+          <w:szCs w:val="20"/>
+        </w:rPr>
+        <w:t xml:space="preserve">이전 버전(v1)에서 사용하던 localStorage(브라우저 종료 후에도 유지)에서 변경됨</w:t>
+      </w:r>
+    </w:p>
+    <w:p>
+      <w:pPr>
+        <w:numPr>
+          <w:ilvl w:val="0"/>
+          <w:numId w:val="2"/>
+        </w:numPr>
+        <w:spacing w:after="40" w:before="40"/>
+      </w:pPr>
+      <w:r>
+        <w:rPr>
+          <w:rFonts w:ascii="맑은 고딕" w:cs="맑은 고딕" w:eastAsia="맑은 고딕" w:hAnsi="맑은 고딕"/>
+          <w:color w:val="333333"/>
+          <w:sz w:val="20"/>
+          <w:szCs w:val="20"/>
+        </w:rPr>
+        <w:t xml:space="preserve">서버에는 일절 저장하지 않으며, Asana API 호출 시 요청에 포함되어 전달됨</w:t>
+      </w:r>
+    </w:p>
+    <!-- 관리자 인증 -->
+    <w:p>
+      <w:pPr>
+        <w:spacing w:after="100" w:before="280"/>
+      </w:pPr>
+      <w:r>
+        <w:rPr>
+          <w:rFonts w:ascii="맑은 고딕" w:cs="맑은 고딕" w:eastAsia="맑은 고딕" w:hAnsi="맑은 고딕"/>
+          <w:b/>
+          <w:bCs/>
+          <w:color w:val="1C2B4A"/>
+          <w:sz w:val="24"/>
+          <w:szCs w:val="24"/>
+        </w:rPr>
+        <w:t>관리자 페이지 인증</w:t>
+      </w:r>
+    </w:p>
+    <w:p>
+      <w:pPr>
+        <w:numPr>
+          <w:ilvl w:val="0"/>
+          <w:numId w:val="2"/>
+        </w:numPr>
+        <w:spacing w:after="40" w:before="40"/>
+      </w:pPr>
+      <w:r>
+        <w:rPr>
+          <w:rFonts w:ascii="맑은 고딕" w:cs="맑은 고딕" w:eastAsia="맑은 고딕" w:hAnsi="맑은 고딕"/>
+          <w:color w:val="333333"/>
+          <w:sz w:val="20"/>
+          <w:szCs w:val="20"/>
+        </w:rPr>
+        <w:t xml:space="preserve">비밀번호 검증은 서버 측 API(/api/admin/auth)에서만 처리 — 클라이언트 코드에 비밀번호 없음</w:t>
+      </w:r>
+    </w:p>
+    <w:p>
+      <w:pPr>
+        <w:numPr>
+          <w:ilvl w:val="0"/>
+          <w:numId w:val="2"/>
+        </w:numPr>
+        <w:spacing w:after="40" w:before="40"/>
+      </w:pPr>
+      <w:r>
+        <w:rPr>
+          <w:rFonts w:ascii="맑은 고딕" w:cs="맑은 고딕" w:eastAsia="맑은 고딕" w:hAnsi="맑은 고딕"/>
+          <w:color w:val="333333"/>
+          <w:sz w:val="20"/>
+          <w:szCs w:val="20"/>
+        </w:rPr>
+        <w:t xml:space="preserve">비밀번호는 Vercel 환경 변수(ADMIN_PASSWORD)로 관리 — 소스코드에 노출 없음</w:t>
+      </w:r>
+    </w:p>
+    <w:p>
+      <w:pPr>
+        <w:numPr>
+          <w:ilvl w:val="0"/>
+          <w:numId w:val="2"/>
+        </w:numPr>
+        <w:spacing w:after="40" w:before="40"/>
+      </w:pPr>
+      <w:r>
+        <w:rPr>
+          <w:rFonts w:ascii="맑은 고딕" w:cs="맑은 고딕" w:eastAsia="맑은 고딕" w:hAnsi="맑은 고딕"/>
+          <w:color w:val="333333"/>
+          <w:sz w:val="20"/>
+          <w:szCs w:val="20"/>
+        </w:rPr>
+        <w:t xml:space="preserve">타이밍 공격 방지(timing-safe compare) 적용 — 응답 시간으로 비밀번호 추측 불가</w:t>
+      </w:r>
+    </w:p>
+    <!-- API 요청 제한 -->
+    <w:p>
+      <w:pPr>
+        <w:spacing w:after="100" w:before="280"/>
+      </w:pPr>
+      <w:r>
+        <w:rPr>
+          <w:rFonts w:ascii="맑은 고딕" w:cs="맑은 고딕" w:eastAsia="맑은 고딕" w:hAnsi="맑은 고딕"/>
+          <w:b/>
+          <w:bCs/>
+          <w:color w:val="1C2B4A"/>
+          <w:sz w:val="24"/>
+          <w:szCs w:val="24"/>
+        </w:rPr>
+        <w:t>API 요청 제한 (Rate Limiting)</w:t>
+      </w:r>
+    </w:p>
+    <w:p>
+      <w:pPr>
+        <w:numPr>
+          <w:ilvl w:val="0"/>
+          <w:numId w:val="2"/>
+        </w:numPr>
+        <w:spacing w:after="40" w:before="40"/>
+      </w:pPr>
+      <w:r>
+        <w:rPr>
+          <w:rFonts w:ascii="맑은 고딕" w:cs="맑은 고딕" w:eastAsia="맑은 고딕" w:hAnsi="맑은 고딕"/>
+          <w:color w:val="333333"/>
+          <w:sz w:val="20"/>
+          <w:szCs w:val="20"/>
+        </w:rPr>
+        <w:t xml:space="preserve">동일 토큰으로 분당 15회 이상 태스크 생성 요청 시 자동 차단 (HTTP 429)</w:t>
+      </w:r>
+    </w:p>
+    <w:p>
+      <w:pPr>
+        <w:numPr>
+          <w:ilvl w:val="0"/>
+          <w:numId w:val="2"/>
+        </w:numPr>
+        <w:spacing w:after="40" w:before="40"/>
+      </w:pPr>
+      <w:r>
+        <w:rPr>
+          <w:rFonts w:ascii="맑은 고딕" w:cs="맑은 고딕" w:eastAsia="맑은 고딕" w:hAnsi="맑은 고딕"/>
+          <w:color w:val="333333"/>
+          <w:sz w:val="20"/>
+          <w:szCs w:val="20"/>
+        </w:rPr>
+        <w:t xml:space="preserve">슬라이딩 윈도우 방식 — 1분 경과 후 자동 해제</w:t>
+      </w:r>
+    </w:p>
+    <!-- Google Doc URL 검증 -->
+    <w:p>
+      <w:pPr>
+        <w:spacing w:after="100" w:before="280"/>
+      </w:pPr>
+      <w:r>
+        <w:rPr>
+          <w:rFonts w:ascii="맑은 고딕" w:cs="맑은 고딕" w:eastAsia="맑은 고딕" w:hAnsi="맑은 고딕"/>
+          <w:b/>
+          <w:bCs/>
+          <w:color w:val="1C2B4A"/>
+          <w:sz w:val="24"/>
+          <w:szCs w:val="24"/>
+        </w:rPr>
+        <w:t>Google Doc URL 검증</w:t>
+      </w:r>
+    </w:p>
+    <w:p>
+      <w:pPr>
+        <w:numPr>
+          <w:ilvl w:val="0"/>
+          <w:numId w:val="2"/>
+        </w:numPr>
+        <w:spacing w:after="40" w:before="40"/>
+      </w:pPr>
+      <w:r>
+        <w:rPr>
+          <w:rFonts w:ascii="맑은 고딕" w:cs="맑은 고딕" w:eastAsia="맑은 고딕" w:hAnsi="맑은 고딕"/>
+          <w:color w:val="333333"/>
+          <w:sz w:val="20"/>
+          <w:szCs w:val="20"/>
+        </w:rPr>
+        <w:t xml:space="preserve">https://docs.google.com/document/d/... 형식만 허용 — http:// 또는 타 도메인 입력 시 오류</w:t>
+      </w:r>
+    </w:p>
+    <w:p>
+      <w:pPr>
+        <w:numPr>
+          <w:ilvl w:val="0"/>
+          <w:numId w:val="2"/>
+        </w:numPr>
+        <w:spacing w:after="40" w:before="40"/>
+      </w:pPr>
+      <w:r>
+        <w:rPr>
+          <w:rFonts w:ascii="맑은 고딕" w:cs="맑은 고딕" w:eastAsia="맑은 고딕" w:hAnsi="맑은 고딕"/>
+          <w:color w:val="333333"/>
+          <w:sz w:val="20"/>
+          <w:szCs w:val="20"/>
+        </w:rPr>
+        <w:t xml:space="preserve">서버 측 SSRF(외부 URL 오염) 방지 목적</w:t>
       </w:r>
     </w:p>
     <w:p>

</xml_diff>